<commit_message>
docs: actualizar capturas del camera-ready a la interfaz rediseñada
</commit_message>
<xml_diff>
--- a/docs/CoNaIISI2026/Qsec_CoNaIISI2026_camera_ready_v2.docx
+++ b/docs/CoNaIISI2026/Qsec_CoNaIISI2026_camera_ready_v2.docx
@@ -380,7 +380,7 @@
             <w:r>
               <w:drawing>
                 <wp:inline distT="0" distB="0" distL="0" distR="0">
-                  <wp:extent cx="2560320" cy="2480310"/>
+                  <wp:extent cx="2560320" cy="1757310"/>
                   <wp:effectExtent t="0" r="0" b="0" l="0"/>
                   <wp:docPr id="20" name="qsec_simulador.png" descr="" title=""/>
                   <wp:cNvGraphicFramePr>
@@ -405,7 +405,7 @@
                         <pic:spPr bwMode="auto">
                           <a:xfrm>
                             <a:off x="0" y="0"/>
-                            <a:ext cx="2560320" cy="2480310"/>
+                            <a:ext cx="2560320" cy="1757310"/>
                           </a:xfrm>
                           <a:prstGeom prst="rect">
                             <a:avLst/>
@@ -448,7 +448,7 @@
             <w:r>
               <w:drawing>
                 <wp:inline distT="0" distB="0" distL="0" distR="0">
-                  <wp:extent cx="2560320" cy="3485769"/>
+                  <wp:extent cx="2560320" cy="2956005"/>
                   <wp:effectExtent t="0" r="0" b="0" l="0"/>
                   <wp:docPr id="21" name="qsec_animacion.png" descr="" title=""/>
                   <wp:cNvGraphicFramePr>
@@ -473,7 +473,7 @@
                         <pic:spPr bwMode="auto">
                           <a:xfrm>
                             <a:off x="0" y="0"/>
-                            <a:ext cx="2560320" cy="3485769"/>
+                            <a:ext cx="2560320" cy="2956005"/>
                           </a:xfrm>
                           <a:prstGeom prst="rect">
                             <a:avLst/>

</xml_diff>

<commit_message>
docs: completar mails y dirección en la filiación del camera-ready
</commit_message>
<xml_diff>
--- a/docs/CoNaIISI2026/Qsec_CoNaIISI2026_camera_ready_v2.docx
+++ b/docs/CoNaIISI2026/Qsec_CoNaIISI2026_camera_ready_v2.docx
@@ -65,7 +65,7 @@
           <w:sz w:val="22"/>
           <w:szCs w:val="22"/>
         </w:rPr>
-        <w:t xml:space="preserve">Zeballos 1341, S2000BQA, Rosario, Santa Fe, Argentina</w:t>
+        <w:t xml:space="preserve">Zeballos 1341, S2000 Rosario, Santa Fe, Argentina</w:t>
       </w:r>
     </w:p>
     <w:p>
@@ -76,11 +76,10 @@
       <w:r>
         <w:rPr>
           <w:rFonts w:ascii="Times New Roman" w:cs="Times New Roman" w:eastAsia="Times New Roman" w:hAnsi="Times New Roman"/>
-          <w:highlight w:val="yellow"/>
           <w:sz w:val="22"/>
           <w:szCs w:val="22"/>
         </w:rPr>
-        <w:t xml:space="preserve">[COMPLETAR: correo electrónico de cada autor]</w:t>
+        <w:t xml:space="preserve">cataldisantinonanu@gmail.com; luciocosen@gmail.com; gasparandres2002@gmail.com; tomaswardoloff@gmail.com</w:t>
       </w:r>
     </w:p>
     <w:p>
@@ -2400,24 +2399,7 @@
           <w:sz w:val="24"/>
           <w:szCs w:val="24"/>
         </w:rPr>
-        <w:t xml:space="preserve">Santino Cataldi. Departamento de Ingeniería en Sistemas de Información, Facultad Regional Rosario, Universidad Tecnológica Nacional. Zeballos 1341, S2000BQA, Rosario, Santa Fe, Argentina. Correo electrónico: </w:t>
-      </w:r>
-      <w:r>
-        <w:rPr>
-          <w:rFonts w:ascii="Times New Roman" w:cs="Times New Roman" w:eastAsia="Times New Roman" w:hAnsi="Times New Roman"/>
-          <w:highlight w:val="yellow"/>
-          <w:sz w:val="24"/>
-          <w:szCs w:val="24"/>
-        </w:rPr>
-        <w:t xml:space="preserve">[COMPLETAR]</w:t>
-      </w:r>
-      <w:r>
-        <w:rPr>
-          <w:rFonts w:ascii="Times New Roman" w:cs="Times New Roman" w:eastAsia="Times New Roman" w:hAnsi="Times New Roman"/>
-          <w:sz w:val="24"/>
-          <w:szCs w:val="24"/>
-        </w:rPr>
-        <w:t xml:space="preserve">.</w:t>
+        <w:t xml:space="preserve">Santino Cataldi. Departamento de Ingeniería en Sistemas de Información, Facultad Regional Rosario, Universidad Tecnológica Nacional. Zeballos 1341, S2000 Rosario, Santa Fe, Argentina. Correo electrónico: cataldisantinonanu@gmail.com.</w:t>
       </w:r>
     </w:p>
     <w:p>

</xml_diff>